<commit_message>
Laboratorio 03: quitar cuadro de momentos y tiempos
Co-Authored-By: Claude Sonnet 5.5 <noreply@anthropic.com>
Claude-Session: https://claude.ai/code/session_0196T8tXAr6RMKpJodyvA85G
</commit_message>
<xml_diff>
--- a/Laboratorio_03.docx
+++ b/Laboratorio_03.docx
@@ -752,365 +752,6 @@
         <w:t>Secuencia de trabajo: comprender el caso → aplicar los cinco criterios → auditar la respuesta → comprobar la fuente original → identificar qué no compartir con la IA → decidir y registrar.</w:t>
       </w:r>
     </w:p>
-    <w:tbl>
-      <w:tblPr>
-        <w:tblStyle w:val="Tablaconcuadrcula"/>
-        <w:tblW w:type="auto" w:w="0"/>
-        <w:tblLayout w:type="fixed"/>
-        <w:tblLook w:firstColumn="1" w:firstRow="1" w:lastColumn="0" w:lastRow="0" w:noHBand="0" w:noVBand="1" w:val="04A0"/>
-      </w:tblPr>
-      <w:tblGrid>
-        <w:gridCol w:w="3249"/>
-        <w:gridCol w:w="3249"/>
-        <w:gridCol w:w="3249"/>
-      </w:tblGrid>
-      <w:tr>
-        <w:tc>
-          <w:tcPr>
-            <w:tcW w:type="dxa" w:w="1538"/>
-            <w:shd w:val="clear" w:color="auto" w:fill="173B8F"/>
-            <w:vAlign w:val="center"/>
-          </w:tcPr>
-          <w:p>
-            <w:r>
-              <w:rPr>
-                <w:rFonts w:ascii="Tahoma" w:hAnsi="Tahoma"/>
-                <w:b/>
-                <w:color w:val="FFFFFF"/>
-                <w:sz w:val="24"/>
-              </w:rPr>
-              <w:t>Momento</w:t>
-            </w:r>
-          </w:p>
-        </w:tc>
-        <w:tc>
-          <w:tcPr>
-            <w:tcW w:type="dxa" w:w="6155"/>
-            <w:shd w:val="clear" w:color="auto" w:fill="173B8F"/>
-            <w:vAlign w:val="center"/>
-          </w:tcPr>
-          <w:p>
-            <w:r>
-              <w:rPr>
-                <w:rFonts w:ascii="Tahoma" w:hAnsi="Tahoma"/>
-                <w:b/>
-                <w:color w:val="FFFFFF"/>
-                <w:sz w:val="24"/>
-              </w:rPr>
-              <w:t>Actividad</w:t>
-            </w:r>
-          </w:p>
-        </w:tc>
-        <w:tc>
-          <w:tcPr>
-            <w:tcW w:type="dxa" w:w="2053"/>
-            <w:shd w:val="clear" w:color="auto" w:fill="173B8F"/>
-            <w:vAlign w:val="center"/>
-          </w:tcPr>
-          <w:p>
-            <w:r>
-              <w:rPr>
-                <w:rFonts w:ascii="Tahoma" w:hAnsi="Tahoma"/>
-                <w:b/>
-                <w:color w:val="FFFFFF"/>
-                <w:sz w:val="24"/>
-              </w:rPr>
-              <w:t>Tiempo</w:t>
-            </w:r>
-          </w:p>
-        </w:tc>
-      </w:tr>
-      <w:tr>
-        <w:tc>
-          <w:tcPr>
-            <w:tcW w:type="dxa" w:w="1538"/>
-          </w:tcPr>
-          <w:p>
-            <w:r>
-              <w:rPr>
-                <w:rFonts w:ascii="Tahoma" w:hAnsi="Tahoma"/>
-                <w:b w:val="0"/>
-                <w:sz w:val="24"/>
-              </w:rPr>
-              <w:t>1</w:t>
-            </w:r>
-          </w:p>
-        </w:tc>
-        <w:tc>
-          <w:tcPr>
-            <w:tcW w:type="dxa" w:w="6155"/>
-          </w:tcPr>
-          <w:p>
-            <w:r>
-              <w:rPr>
-                <w:rFonts w:ascii="Tahoma" w:hAnsi="Tahoma"/>
-                <w:b w:val="0"/>
-                <w:sz w:val="24"/>
-              </w:rPr>
-              <w:t>Bienvenida y punto de partida para quienes se incorporan</w:t>
-            </w:r>
-          </w:p>
-        </w:tc>
-        <w:tc>
-          <w:tcPr>
-            <w:tcW w:type="dxa" w:w="2053"/>
-          </w:tcPr>
-          <w:p>
-            <w:r>
-              <w:rPr>
-                <w:rFonts w:ascii="Tahoma" w:hAnsi="Tahoma"/>
-                <w:b w:val="0"/>
-                <w:sz w:val="24"/>
-              </w:rPr>
-              <w:t>10 min</w:t>
-            </w:r>
-          </w:p>
-        </w:tc>
-      </w:tr>
-      <w:tr>
-        <w:tc>
-          <w:tcPr>
-            <w:tcW w:type="dxa" w:w="1538"/>
-            <w:shd w:val="clear" w:color="auto" w:fill="EAF1FB"/>
-          </w:tcPr>
-          <w:p>
-            <w:r>
-              <w:rPr>
-                <w:rFonts w:ascii="Tahoma" w:hAnsi="Tahoma"/>
-                <w:b w:val="0"/>
-                <w:sz w:val="24"/>
-              </w:rPr>
-              <w:t>2</w:t>
-            </w:r>
-          </w:p>
-        </w:tc>
-        <w:tc>
-          <w:tcPr>
-            <w:tcW w:type="dxa" w:w="6155"/>
-            <w:shd w:val="clear" w:color="auto" w:fill="EAF1FB"/>
-          </w:tcPr>
-          <w:p>
-            <w:r>
-              <w:rPr>
-                <w:rFonts w:ascii="Tahoma" w:hAnsi="Tahoma"/>
-                <w:b w:val="0"/>
-                <w:sz w:val="24"/>
-              </w:rPr>
-              <w:t>Desarrollo teórico sobre pensamiento crítico y ética</w:t>
-            </w:r>
-          </w:p>
-        </w:tc>
-        <w:tc>
-          <w:tcPr>
-            <w:tcW w:type="dxa" w:w="2053"/>
-            <w:shd w:val="clear" w:color="auto" w:fill="EAF1FB"/>
-          </w:tcPr>
-          <w:p>
-            <w:r>
-              <w:rPr>
-                <w:rFonts w:ascii="Tahoma" w:hAnsi="Tahoma"/>
-                <w:b w:val="0"/>
-                <w:sz w:val="24"/>
-              </w:rPr>
-              <w:t>40 min</w:t>
-            </w:r>
-          </w:p>
-        </w:tc>
-      </w:tr>
-      <w:tr>
-        <w:tc>
-          <w:tcPr>
-            <w:tcW w:type="dxa" w:w="1538"/>
-          </w:tcPr>
-          <w:p>
-            <w:r>
-              <w:rPr>
-                <w:rFonts w:ascii="Tahoma" w:hAnsi="Tahoma"/>
-                <w:b w:val="0"/>
-                <w:sz w:val="24"/>
-              </w:rPr>
-              <w:t>3</w:t>
-            </w:r>
-          </w:p>
-        </w:tc>
-        <w:tc>
-          <w:tcPr>
-            <w:tcW w:type="dxa" w:w="6155"/>
-          </w:tcPr>
-          <w:p>
-            <w:r>
-              <w:rPr>
-                <w:rFonts w:ascii="Tahoma" w:hAnsi="Tahoma"/>
-                <w:b w:val="0"/>
-                <w:sz w:val="24"/>
-              </w:rPr>
-              <w:t>Demostración de una auditoría completa en pantalla</w:t>
-            </w:r>
-          </w:p>
-        </w:tc>
-        <w:tc>
-          <w:tcPr>
-            <w:tcW w:type="dxa" w:w="2053"/>
-          </w:tcPr>
-          <w:p>
-            <w:r>
-              <w:rPr>
-                <w:rFonts w:ascii="Tahoma" w:hAnsi="Tahoma"/>
-                <w:b w:val="0"/>
-                <w:sz w:val="24"/>
-              </w:rPr>
-              <w:t>20 min</w:t>
-            </w:r>
-          </w:p>
-        </w:tc>
-      </w:tr>
-      <w:tr>
-        <w:tc>
-          <w:tcPr>
-            <w:tcW w:type="dxa" w:w="1538"/>
-            <w:shd w:val="clear" w:color="auto" w:fill="EAF1FB"/>
-          </w:tcPr>
-          <w:p>
-            <w:r>
-              <w:rPr>
-                <w:rFonts w:ascii="Tahoma" w:hAnsi="Tahoma"/>
-                <w:b w:val="0"/>
-                <w:sz w:val="24"/>
-              </w:rPr>
-              <w:t>4</w:t>
-            </w:r>
-          </w:p>
-        </w:tc>
-        <w:tc>
-          <w:tcPr>
-            <w:tcW w:type="dxa" w:w="6155"/>
-            <w:shd w:val="clear" w:color="auto" w:fill="EAF1FB"/>
-          </w:tcPr>
-          <w:p>
-            <w:r>
-              <w:rPr>
-                <w:rFonts w:ascii="Tahoma" w:hAnsi="Tahoma"/>
-                <w:b w:val="0"/>
-                <w:sz w:val="24"/>
-              </w:rPr>
-              <w:t>Auditoría individual de una respuesta y verificación de fuente</w:t>
-            </w:r>
-          </w:p>
-        </w:tc>
-        <w:tc>
-          <w:tcPr>
-            <w:tcW w:type="dxa" w:w="2053"/>
-            <w:shd w:val="clear" w:color="auto" w:fill="EAF1FB"/>
-          </w:tcPr>
-          <w:p>
-            <w:r>
-              <w:rPr>
-                <w:rFonts w:ascii="Tahoma" w:hAnsi="Tahoma"/>
-                <w:b w:val="0"/>
-                <w:sz w:val="24"/>
-              </w:rPr>
-              <w:t>35 min</w:t>
-            </w:r>
-          </w:p>
-        </w:tc>
-      </w:tr>
-      <w:tr>
-        <w:tc>
-          <w:tcPr>
-            <w:tcW w:type="dxa" w:w="1538"/>
-          </w:tcPr>
-          <w:p>
-            <w:r>
-              <w:rPr>
-                <w:rFonts w:ascii="Tahoma" w:hAnsi="Tahoma"/>
-                <w:b w:val="0"/>
-                <w:sz w:val="24"/>
-              </w:rPr>
-              <w:t>5</w:t>
-            </w:r>
-          </w:p>
-        </w:tc>
-        <w:tc>
-          <w:tcPr>
-            <w:tcW w:type="dxa" w:w="6155"/>
-          </w:tcPr>
-          <w:p>
-            <w:r>
-              <w:rPr>
-                <w:rFonts w:ascii="Tahoma" w:hAnsi="Tahoma"/>
-                <w:b w:val="0"/>
-                <w:sz w:val="24"/>
-              </w:rPr>
-              <w:t>Redacción de la declaración de uso y cierre</w:t>
-            </w:r>
-          </w:p>
-        </w:tc>
-        <w:tc>
-          <w:tcPr>
-            <w:tcW w:type="dxa" w:w="2053"/>
-          </w:tcPr>
-          <w:p>
-            <w:r>
-              <w:rPr>
-                <w:rFonts w:ascii="Tahoma" w:hAnsi="Tahoma"/>
-                <w:b w:val="0"/>
-                <w:sz w:val="24"/>
-              </w:rPr>
-              <w:t>15 min</w:t>
-            </w:r>
-          </w:p>
-        </w:tc>
-      </w:tr>
-      <w:tr>
-        <w:tc>
-          <w:tcPr>
-            <w:tcW w:type="dxa" w:w="1538"/>
-            <w:shd w:val="clear" w:color="auto" w:fill="EAF1FB"/>
-          </w:tcPr>
-          <w:p>
-            <w:r>
-              <w:rPr>
-                <w:rFonts w:ascii="Tahoma" w:hAnsi="Tahoma"/>
-                <w:b w:val="0"/>
-                <w:sz w:val="24"/>
-              </w:rPr>
-              <w:t>Total</w:t>
-            </w:r>
-          </w:p>
-        </w:tc>
-        <w:tc>
-          <w:tcPr>
-            <w:tcW w:type="dxa" w:w="6155"/>
-            <w:shd w:val="clear" w:color="auto" w:fill="EAF1FB"/>
-          </w:tcPr>
-          <w:p>
-            <w:r>
-              <w:rPr>
-                <w:rFonts w:ascii="Tahoma" w:hAnsi="Tahoma"/>
-                <w:b w:val="0"/>
-                <w:sz w:val="24"/>
-              </w:rPr>
-            </w:r>
-          </w:p>
-        </w:tc>
-        <w:tc>
-          <w:tcPr>
-            <w:tcW w:type="dxa" w:w="2053"/>
-            <w:shd w:val="clear" w:color="auto" w:fill="EAF1FB"/>
-          </w:tcPr>
-          <w:p>
-            <w:r>
-              <w:rPr>
-                <w:rFonts w:ascii="Tahoma" w:hAnsi="Tahoma"/>
-                <w:b w:val="0"/>
-                <w:sz w:val="24"/>
-              </w:rPr>
-              <w:t>120 min</w:t>
-            </w:r>
-          </w:p>
-        </w:tc>
-      </w:tr>
-    </w:tbl>
     <w:p/>
     <w:p>
       <w:pPr>

</xml_diff>

<commit_message>
Restaurar las 30 diapositivas de la Sesión 03; recortar el Laboratorio 03 a 50 minutos
Co-Authored-By: Claude Sonnet 5.5 <noreply@anthropic.com>
Claude-Session: https://claude.ai/code/session_0196T8tXAr6RMKpJodyvA85G
</commit_message>
<xml_diff>
--- a/Laboratorio_03.docx
+++ b/Laboratorio_03.docx
@@ -850,7 +850,7 @@
           <w:i w:val="0"/>
           <w:sz w:val="24"/>
         </w:rPr>
-        <w:t>Tiempo: 5 minutos. Complete el cuadro antes de evaluar la respuesta de la IA.</w:t>
+        <w:t>Tiempo: 3 minutos. Complete el cuadro antes de evaluar la respuesta de la IA.</w:t>
       </w:r>
     </w:p>
     <w:tbl>
@@ -1088,7 +1088,7 @@
           <w:i w:val="0"/>
           <w:sz w:val="24"/>
         </w:rPr>
-        <w:t>Tiempo: 5 minutos. Lea la respuesta generada por la IA (preparada por la docente para esta sesión) antes de auditarla.</w:t>
+        <w:t>Tiempo: 3 minutos. Lea la respuesta generada por la IA (preparada por la docente para esta sesión) antes de auditarla.</w:t>
       </w:r>
     </w:p>
     <w:tbl>
@@ -1152,7 +1152,7 @@
           <w:i w:val="0"/>
           <w:sz w:val="24"/>
         </w:rPr>
-        <w:t>Tiempo: 10 minutos. Aplique cada criterio a la respuesta anterior y registre su observación.</w:t>
+        <w:t>Tiempo: 8 minutos. Aplique cada criterio a la respuesta anterior y registre su observación.</w:t>
       </w:r>
     </w:p>
     <w:tbl>
@@ -1476,7 +1476,7 @@
           <w:i w:val="0"/>
           <w:sz w:val="24"/>
         </w:rPr>
-        <w:t>Tiempo: 10 minutos. Busque la referencia citada en Google Scholar, Crossref o en la página de la revista. Registre exactamente lo que encuentre.</w:t>
+        <w:t>Tiempo: 7 minutos. Busque la referencia citada en Google Scholar, Crossref o en la página de la revista. Registre exactamente lo que encuentre.</w:t>
       </w:r>
     </w:p>
     <w:tbl>
@@ -1854,7 +1854,7 @@
           <w:i w:val="0"/>
           <w:sz w:val="24"/>
         </w:rPr>
-        <w:t>Tiempo: 10 minutos. Daniel también pensó en compartir la tabla de resultados del proyecto institucional no publicado. Marque qué elementos de esa tabla podrían compartirse con una IA gratuita y cuáles no.</w:t>
+        <w:t>Tiempo: 5 minutos. Daniel también pensó en compartir la tabla de resultados del proyecto institucional no publicado. Marque qué elementos de esa tabla podrían compartirse con una IA gratuita y cuáles no.</w:t>
       </w:r>
     </w:p>
     <w:tbl>
@@ -2178,7 +2178,7 @@
           <w:i w:val="0"/>
           <w:sz w:val="24"/>
         </w:rPr>
-        <w:t>Tiempo: 5 minutos. Decida si incluirá la respuesta de la IA en su tesis y cómo.</w:t>
+        <w:t>Tiempo: 4 minutos. Decida si incluirá la respuesta de la IA en su tesis y cómo.</w:t>
       </w:r>
     </w:p>
     <w:p>
@@ -2278,229 +2278,7 @@
           <w:rFonts w:ascii="Tahoma" w:hAnsi="Tahoma"/>
           <w:sz w:val="24"/>
         </w:rPr>
-        <w:t>A. Comprensión del caso (3 min)</w:t>
-      </w:r>
-    </w:p>
-    <w:tbl>
-      <w:tblPr>
-        <w:tblStyle w:val="Tablaconcuadrcula"/>
-        <w:tblW w:type="auto" w:w="0"/>
-        <w:tblLayout w:type="fixed"/>
-        <w:tblLook w:firstColumn="1" w:firstRow="1" w:lastColumn="0" w:lastRow="0" w:noHBand="0" w:noVBand="1" w:val="04A0"/>
-      </w:tblPr>
-      <w:tblGrid>
-        <w:gridCol w:w="4873"/>
-        <w:gridCol w:w="4873"/>
-      </w:tblGrid>
-      <w:tr>
-        <w:tc>
-          <w:tcPr>
-            <w:tcW w:type="dxa" w:w="3248"/>
-            <w:shd w:val="clear" w:color="auto" w:fill="173B8F"/>
-            <w:vAlign w:val="center"/>
-          </w:tcPr>
-          <w:p>
-            <w:r>
-              <w:rPr>
-                <w:rFonts w:ascii="Tahoma" w:hAnsi="Tahoma"/>
-                <w:b/>
-                <w:color w:val="FFFFFF"/>
-                <w:sz w:val="24"/>
-              </w:rPr>
-              <w:t>Elemento</w:t>
-            </w:r>
-          </w:p>
-        </w:tc>
-        <w:tc>
-          <w:tcPr>
-            <w:tcW w:type="dxa" w:w="6498"/>
-            <w:shd w:val="clear" w:color="auto" w:fill="173B8F"/>
-            <w:vAlign w:val="center"/>
-          </w:tcPr>
-          <w:p>
-            <w:r>
-              <w:rPr>
-                <w:rFonts w:ascii="Tahoma" w:hAnsi="Tahoma"/>
-                <w:b/>
-                <w:color w:val="FFFFFF"/>
-                <w:sz w:val="24"/>
-              </w:rPr>
-              <w:t>Análisis del estudiante</w:t>
-            </w:r>
-          </w:p>
-        </w:tc>
-      </w:tr>
-      <w:tr>
-        <w:tc>
-          <w:tcPr>
-            <w:tcW w:type="dxa" w:w="3248"/>
-          </w:tcPr>
-          <w:p>
-            <w:r>
-              <w:rPr>
-                <w:rFonts w:ascii="Tahoma" w:hAnsi="Tahoma"/>
-                <w:b w:val="0"/>
-                <w:sz w:val="24"/>
-              </w:rPr>
-              <w:t>Tarea de Fiorella</w:t>
-            </w:r>
-          </w:p>
-        </w:tc>
-        <w:tc>
-          <w:tcPr>
-            <w:tcW w:type="dxa" w:w="6498"/>
-          </w:tcPr>
-          <w:p>
-            <w:r>
-              <w:rPr>
-                <w:rFonts w:ascii="Tahoma" w:hAnsi="Tahoma"/>
-                <w:b w:val="0"/>
-                <w:sz w:val="24"/>
-              </w:rPr>
-            </w:r>
-          </w:p>
-        </w:tc>
-      </w:tr>
-      <w:tr>
-        <w:tc>
-          <w:tcPr>
-            <w:tcW w:type="dxa" w:w="3248"/>
-            <w:shd w:val="clear" w:color="auto" w:fill="EAF1FB"/>
-          </w:tcPr>
-          <w:p>
-            <w:r>
-              <w:rPr>
-                <w:rFonts w:ascii="Tahoma" w:hAnsi="Tahoma"/>
-                <w:b w:val="0"/>
-                <w:sz w:val="24"/>
-              </w:rPr>
-              <w:t>Lo que le pidió a la IA</w:t>
-            </w:r>
-          </w:p>
-        </w:tc>
-        <w:tc>
-          <w:tcPr>
-            <w:tcW w:type="dxa" w:w="6498"/>
-            <w:shd w:val="clear" w:color="auto" w:fill="EAF1FB"/>
-          </w:tcPr>
-          <w:p>
-            <w:r>
-              <w:rPr>
-                <w:rFonts w:ascii="Tahoma" w:hAnsi="Tahoma"/>
-                <w:b w:val="0"/>
-                <w:sz w:val="24"/>
-              </w:rPr>
-            </w:r>
-          </w:p>
-        </w:tc>
-      </w:tr>
-      <w:tr>
-        <w:tc>
-          <w:tcPr>
-            <w:tcW w:type="dxa" w:w="3248"/>
-          </w:tcPr>
-          <w:p>
-            <w:r>
-              <w:rPr>
-                <w:rFonts w:ascii="Tahoma" w:hAnsi="Tahoma"/>
-                <w:b w:val="0"/>
-                <w:sz w:val="24"/>
-              </w:rPr>
-              <w:t>Lo que NO le pidió</w:t>
-            </w:r>
-          </w:p>
-        </w:tc>
-        <w:tc>
-          <w:tcPr>
-            <w:tcW w:type="dxa" w:w="6498"/>
-          </w:tcPr>
-          <w:p>
-            <w:r>
-              <w:rPr>
-                <w:rFonts w:ascii="Tahoma" w:hAnsi="Tahoma"/>
-                <w:b w:val="0"/>
-                <w:sz w:val="24"/>
-              </w:rPr>
-            </w:r>
-          </w:p>
-        </w:tc>
-      </w:tr>
-      <w:tr>
-        <w:tc>
-          <w:tcPr>
-            <w:tcW w:type="dxa" w:w="3248"/>
-            <w:shd w:val="clear" w:color="auto" w:fill="EAF1FB"/>
-          </w:tcPr>
-          <w:p>
-            <w:r>
-              <w:rPr>
-                <w:rFonts w:ascii="Tahoma" w:hAnsi="Tahoma"/>
-                <w:b w:val="0"/>
-                <w:sz w:val="24"/>
-              </w:rPr>
-              <w:t>Exigencia de la revista</w:t>
-            </w:r>
-          </w:p>
-        </w:tc>
-        <w:tc>
-          <w:tcPr>
-            <w:tcW w:type="dxa" w:w="6498"/>
-            <w:shd w:val="clear" w:color="auto" w:fill="EAF1FB"/>
-          </w:tcPr>
-          <w:p>
-            <w:r>
-              <w:rPr>
-                <w:rFonts w:ascii="Tahoma" w:hAnsi="Tahoma"/>
-                <w:b w:val="0"/>
-                <w:sz w:val="24"/>
-              </w:rPr>
-            </w:r>
-          </w:p>
-        </w:tc>
-      </w:tr>
-      <w:tr>
-        <w:tc>
-          <w:tcPr>
-            <w:tcW w:type="dxa" w:w="3248"/>
-          </w:tcPr>
-          <w:p>
-            <w:r>
-              <w:rPr>
-                <w:rFonts w:ascii="Tahoma" w:hAnsi="Tahoma"/>
-                <w:b w:val="0"/>
-                <w:sz w:val="24"/>
-              </w:rPr>
-              <w:t>Riesgo si no declara el uso de IA</w:t>
-            </w:r>
-          </w:p>
-        </w:tc>
-        <w:tc>
-          <w:tcPr>
-            <w:tcW w:type="dxa" w:w="6498"/>
-          </w:tcPr>
-          <w:p>
-            <w:r>
-              <w:rPr>
-                <w:rFonts w:ascii="Tahoma" w:hAnsi="Tahoma"/>
-                <w:b w:val="0"/>
-                <w:sz w:val="24"/>
-              </w:rPr>
-            </w:r>
-          </w:p>
-        </w:tc>
-      </w:tr>
-    </w:tbl>
-    <w:p/>
-    <w:p>
-      <w:pPr>
-        <w:pStyle w:val="Ttulo3"/>
-      </w:pPr>
-      <w:r>
-        <w:rPr>
-          <w:rFonts w:ascii="Tahoma" w:hAnsi="Tahoma"/>
-          <w:sz w:val="24"/>
-        </w:rPr>
-        <w:t>B. ¿Qué debe incluir la declaración? (5 min)</w:t>
+        <w:t>A. ¿Qué debe incluir la declaración? (4 min)</w:t>
       </w:r>
     </w:p>
     <w:p>
@@ -2824,7 +2602,7 @@
           <w:rFonts w:ascii="Tahoma" w:hAnsi="Tahoma"/>
           <w:sz w:val="24"/>
         </w:rPr>
-        <w:t>C. Redacción de la declaración (5 min)</w:t>
+        <w:t>B. Redacción de la declaración (6 min)</w:t>
       </w:r>
     </w:p>
     <w:p>
@@ -2847,62 +2625,6 @@
           <w:sz w:val="24"/>
         </w:rPr>
         <w:t>____________________________________________________________________</w:t>
-      </w:r>
-    </w:p>
-    <w:p>
-      <w:r>
-        <w:rPr>
-          <w:rFonts w:ascii="Tahoma" w:hAnsi="Tahoma"/>
-          <w:b w:val="0"/>
-          <w:i w:val="0"/>
-          <w:sz w:val="24"/>
-        </w:rPr>
-        <w:t>____________________________________________________________________</w:t>
-      </w:r>
-    </w:p>
-    <w:p>
-      <w:r>
-        <w:rPr>
-          <w:rFonts w:ascii="Tahoma" w:hAnsi="Tahoma"/>
-          <w:b w:val="0"/>
-          <w:i w:val="0"/>
-          <w:sz w:val="24"/>
-        </w:rPr>
-        <w:t>____________________________________________________________________</w:t>
-      </w:r>
-    </w:p>
-    <w:p>
-      <w:r>
-        <w:rPr>
-          <w:rFonts w:ascii="Tahoma" w:hAnsi="Tahoma"/>
-          <w:b w:val="0"/>
-          <w:i w:val="0"/>
-          <w:sz w:val="24"/>
-        </w:rPr>
-        <w:t>____________________________________________________________________</w:t>
-      </w:r>
-    </w:p>
-    <w:p>
-      <w:pPr>
-        <w:pStyle w:val="Ttulo3"/>
-      </w:pPr>
-      <w:r>
-        <w:rPr>
-          <w:rFonts w:ascii="Tahoma" w:hAnsi="Tahoma"/>
-          <w:sz w:val="24"/>
-        </w:rPr>
-        <w:t>D. Decisión del investigador (2 min)</w:t>
-      </w:r>
-    </w:p>
-    <w:p>
-      <w:r>
-        <w:rPr>
-          <w:rFonts w:ascii="Tahoma" w:hAnsi="Tahoma"/>
-          <w:b w:val="0"/>
-          <w:i w:val="0"/>
-          <w:sz w:val="24"/>
-        </w:rPr>
-        <w:t>Escriba el prompt que usted le daría a la IA para traducir el artículo de Fiorella sin que interprete resultados ni invente datos:</w:t>
       </w:r>
     </w:p>
     <w:p>

</xml_diff>